<commit_message>
Add reasoning, Terminal-Bench-style tasks, multimodal and raw data to the short message and price list
Co-Authored-By: Claude Opus 5.5 <noreply@anthropic.com>
Claude-Session: https://claude.ai/code/session_01V2WBTUaYVg19XogRfpJJ3d
</commit_message>
<xml_diff>
--- a/collateral/SimReal-产品与服务报价单.docx
+++ b/collateral/SimReal-产品与服务报价单.docx
@@ -913,7 +913,7 @@
                 <w:sz w:val="18"/>
                 <w:szCs w:val="18"/>
               </w:rPr>
-              <w:t xml:space="preserve">CoT 推理链数据</w:t>
+              <w:t xml:space="preserve">CoT / Reasoning 推理数据</w:t>
             </w:r>
           </w:p>
         </w:tc>
@@ -945,7 +945,7 @@
                 <w:sz w:val="17"/>
                 <w:szCs w:val="17"/>
               </w:rPr>
-              <w:t xml:space="preserve">含完整推理步骤的解答，逐步校验</w:t>
+              <w:t xml:space="preserve">含完整推理步骤的解答，覆盖数学、代码、金融等，逐步校验</w:t>
             </w:r>
           </w:p>
         </w:tc>
@@ -3709,7 +3709,7 @@
                 <w:sz w:val="18"/>
                 <w:szCs w:val="18"/>
               </w:rPr>
-              <w:t xml:space="preserve">标准环境授权（非独家）</w:t>
+              <w:t xml:space="preserve">终端任务（Terminal-Bench 类）</w:t>
             </w:r>
           </w:p>
         </w:tc>
@@ -3741,7 +3741,7 @@
                 <w:sz w:val="17"/>
                 <w:szCs w:val="17"/>
               </w:rPr>
-              <w:t xml:space="preserve">交易、财务月结、软件工程、数学证明、逻辑推理、AI 研究、未来预测</w:t>
+              <w:t xml:space="preserve">命令行环境中的多步 Agent 任务，含测试与自动评分</w:t>
             </w:r>
           </w:p>
         </w:tc>
@@ -3773,7 +3773,7 @@
                 <w:sz w:val="17"/>
                 <w:szCs w:val="17"/>
               </w:rPr>
-              <w:t xml:space="preserve">环境 / 季度</w:t>
+              <w:t xml:space="preserve">任务</w:t>
             </w:r>
           </w:p>
         </w:tc>
@@ -3806,7 +3806,7 @@
                 <w:sz w:val="18"/>
                 <w:szCs w:val="18"/>
               </w:rPr>
-              <w:t xml:space="preserve">300,000 起</w:t>
+              <w:t xml:space="preserve">2,000 – 12,000</w:t>
             </w:r>
           </w:p>
         </w:tc>
@@ -3839,7 +3839,7 @@
                 <w:sz w:val="18"/>
                 <w:szCs w:val="18"/>
               </w:rPr>
-              <w:t xml:space="preserve">50,000 起</w:t>
+              <w:t xml:space="preserve">300 – 2,000</w:t>
             </w:r>
           </w:p>
         </w:tc>
@@ -3910,7 +3910,7 @@
                 <w:sz w:val="18"/>
                 <w:szCs w:val="18"/>
               </w:rPr>
-              <w:t xml:space="preserve">企业定制环境</w:t>
+              <w:t xml:space="preserve">标准环境授权（非独家）</w:t>
             </w:r>
           </w:p>
         </w:tc>
@@ -3942,7 +3942,7 @@
                 <w:sz w:val="17"/>
                 <w:szCs w:val="17"/>
               </w:rPr>
-              <w:t xml:space="preserve">围绕客户工作流搭建专属训练环境与验证器</w:t>
+              <w:t xml:space="preserve">交易、财务月结、软件工程、数学证明、逻辑推理、AI 研究、未来预测</w:t>
             </w:r>
           </w:p>
         </w:tc>
@@ -3974,7 +3974,7 @@
                 <w:sz w:val="17"/>
                 <w:szCs w:val="17"/>
               </w:rPr>
-              <w:t xml:space="preserve">项目</w:t>
+              <w:t xml:space="preserve">环境 / 季度</w:t>
             </w:r>
           </w:p>
         </w:tc>
@@ -4007,7 +4007,7 @@
                 <w:sz w:val="18"/>
                 <w:szCs w:val="18"/>
               </w:rPr>
-              <w:t xml:space="preserve">500,000 起</w:t>
+              <w:t xml:space="preserve">300,000 起</w:t>
             </w:r>
           </w:p>
         </w:tc>
@@ -4040,7 +4040,7 @@
                 <w:sz w:val="18"/>
                 <w:szCs w:val="18"/>
               </w:rPr>
-              <w:t xml:space="preserve">80,000 起</w:t>
+              <w:t xml:space="preserve">50,000 起</w:t>
             </w:r>
           </w:p>
         </w:tc>
@@ -4051,15 +4051,45 @@
         </w:trPr>
         <w:tc>
           <w:tcPr>
-            <w:tcW w:type="dxa" w:w="9638"/>
-            <w:gridSpan w:val="6"/>
-            <w:tcBorders>
-              <w:top w:val="single" w:color="D9D6CF" w:sz="4"/>
-              <w:left w:val="none" w:color="FFFFFF" w:sz="0"/>
-              <w:bottom w:val="single" w:color="D9D6CF" w:sz="4"/>
-              <w:right w:val="none" w:color="FFFFFF" w:sz="0"/>
-            </w:tcBorders>
-            <w:shd w:fill="F2F0EB" w:color="auto" w:val="clear"/>
+            <w:tcW w:type="dxa" w:w="760"/>
+            <w:tcBorders>
+              <w:top w:val="single" w:color="D9D6CF" w:sz="4"/>
+              <w:left w:val="none" w:color="FFFFFF" w:sz="0"/>
+              <w:bottom w:val="single" w:color="D9D6CF" w:sz="4"/>
+              <w:right w:val="none" w:color="FFFFFF" w:sz="0"/>
+            </w:tcBorders>
+            <w:tcMar>
+              <w:top w:type="dxa" w:w="80"/>
+              <w:left w:type="dxa" w:w="100"/>
+              <w:bottom w:type="dxa" w:w="80"/>
+              <w:right w:type="dxa" w:w="100"/>
+            </w:tcMar>
+            <w:vAlign w:val="center"/>
+          </w:tcPr>
+          <w:p>
+            <w:pPr>
+              <w:spacing w:after="0" w:line="270"/>
+            </w:pPr>
+            <w:r>
+              <w:rPr>
+                <w:rFonts w:ascii="Arial" w:cs="Arial" w:eastAsia="Microsoft YaHei" w:hAnsi="Arial"/>
+                <w:color w:val="6E6C66"/>
+                <w:sz w:val="17"/>
+                <w:szCs w:val="17"/>
+              </w:rPr>
+              <w:t xml:space="preserve">D04</w:t>
+            </w:r>
+          </w:p>
+        </w:tc>
+        <w:tc>
+          <w:tcPr>
+            <w:tcW w:type="dxa" w:w="2050"/>
+            <w:tcBorders>
+              <w:top w:val="single" w:color="D9D6CF" w:sz="4"/>
+              <w:left w:val="none" w:color="FFFFFF" w:sz="0"/>
+              <w:bottom w:val="single" w:color="D9D6CF" w:sz="4"/>
+              <w:right w:val="none" w:color="FFFFFF" w:sz="0"/>
+            </w:tcBorders>
             <w:tcMar>
               <w:top w:type="dxa" w:w="80"/>
               <w:left w:type="dxa" w:w="100"/>
@@ -4077,31 +4107,141 @@
                 <w:rFonts w:ascii="Arial" w:cs="Arial" w:eastAsia="Microsoft YaHei" w:hAnsi="Arial"/>
                 <w:b/>
                 <w:bCs/>
-                <w:color w:val="C2410C"/>
-                <w:sz w:val="18"/>
-                <w:szCs w:val="18"/>
-              </w:rPr>
-              <w:t xml:space="preserve">E</w:t>
-            </w:r>
-            <w:r>
-              <w:rPr>
-                <w:rFonts w:ascii="Arial" w:cs="Arial" w:eastAsia="Microsoft YaHei" w:hAnsi="Arial"/>
-                <w:b/>
-                <w:bCs/>
-                <w:color w:val="111110"/>
-                <w:sz w:val="18"/>
-                <w:szCs w:val="18"/>
-              </w:rPr>
-              <w:t xml:space="preserve">   服务</w:t>
-            </w:r>
-            <w:r>
-              <w:rPr>
-                <w:rFonts w:ascii="Arial" w:cs="Arial" w:eastAsia="Microsoft YaHei" w:hAnsi="Arial"/>
-                <w:color w:val="6E6C66"/>
-                <w:sz w:val="16"/>
-                <w:szCs w:val="16"/>
-              </w:rPr>
-              <w:t xml:space="preserve">   Services</w:t>
+                <w:color w:val="111110"/>
+                <w:sz w:val="18"/>
+                <w:szCs w:val="18"/>
+              </w:rPr>
+              <w:t xml:space="preserve">企业定制环境</w:t>
+            </w:r>
+          </w:p>
+        </w:tc>
+        <w:tc>
+          <w:tcPr>
+            <w:tcW w:type="dxa" w:w="2800"/>
+            <w:tcBorders>
+              <w:top w:val="single" w:color="D9D6CF" w:sz="4"/>
+              <w:left w:val="none" w:color="FFFFFF" w:sz="0"/>
+              <w:bottom w:val="single" w:color="D9D6CF" w:sz="4"/>
+              <w:right w:val="none" w:color="FFFFFF" w:sz="0"/>
+            </w:tcBorders>
+            <w:tcMar>
+              <w:top w:type="dxa" w:w="80"/>
+              <w:left w:type="dxa" w:w="100"/>
+              <w:bottom w:type="dxa" w:w="80"/>
+              <w:right w:type="dxa" w:w="100"/>
+            </w:tcMar>
+            <w:vAlign w:val="center"/>
+          </w:tcPr>
+          <w:p>
+            <w:pPr>
+              <w:spacing w:after="0" w:line="270"/>
+            </w:pPr>
+            <w:r>
+              <w:rPr>
+                <w:rFonts w:ascii="Arial" w:cs="Arial" w:eastAsia="Microsoft YaHei" w:hAnsi="Arial"/>
+                <w:color w:val="33322F"/>
+                <w:sz w:val="17"/>
+                <w:szCs w:val="17"/>
+              </w:rPr>
+              <w:t xml:space="preserve">围绕客户工作流搭建专属训练环境与验证器</w:t>
+            </w:r>
+          </w:p>
+        </w:tc>
+        <w:tc>
+          <w:tcPr>
+            <w:tcW w:type="dxa" w:w="1000"/>
+            <w:tcBorders>
+              <w:top w:val="single" w:color="D9D6CF" w:sz="4"/>
+              <w:left w:val="none" w:color="FFFFFF" w:sz="0"/>
+              <w:bottom w:val="single" w:color="D9D6CF" w:sz="4"/>
+              <w:right w:val="none" w:color="FFFFFF" w:sz="0"/>
+            </w:tcBorders>
+            <w:tcMar>
+              <w:top w:type="dxa" w:w="80"/>
+              <w:left w:type="dxa" w:w="100"/>
+              <w:bottom w:type="dxa" w:w="80"/>
+              <w:right w:type="dxa" w:w="100"/>
+            </w:tcMar>
+            <w:vAlign w:val="center"/>
+          </w:tcPr>
+          <w:p>
+            <w:pPr>
+              <w:spacing w:after="0" w:line="270"/>
+            </w:pPr>
+            <w:r>
+              <w:rPr>
+                <w:rFonts w:ascii="Arial" w:cs="Arial" w:eastAsia="Microsoft YaHei" w:hAnsi="Arial"/>
+                <w:color w:val="33322F"/>
+                <w:sz w:val="17"/>
+                <w:szCs w:val="17"/>
+              </w:rPr>
+              <w:t xml:space="preserve">项目</w:t>
+            </w:r>
+          </w:p>
+        </w:tc>
+        <w:tc>
+          <w:tcPr>
+            <w:tcW w:type="dxa" w:w="1600"/>
+            <w:tcBorders>
+              <w:top w:val="single" w:color="D9D6CF" w:sz="4"/>
+              <w:left w:val="none" w:color="FFFFFF" w:sz="0"/>
+              <w:bottom w:val="single" w:color="D9D6CF" w:sz="4"/>
+              <w:right w:val="none" w:color="FFFFFF" w:sz="0"/>
+            </w:tcBorders>
+            <w:tcMar>
+              <w:top w:type="dxa" w:w="80"/>
+              <w:left w:type="dxa" w:w="100"/>
+              <w:bottom w:type="dxa" w:w="80"/>
+              <w:right w:type="dxa" w:w="100"/>
+            </w:tcMar>
+            <w:vAlign w:val="center"/>
+          </w:tcPr>
+          <w:p>
+            <w:pPr>
+              <w:spacing w:after="0" w:line="270"/>
+              <w:jc w:val="right"/>
+            </w:pPr>
+            <w:r>
+              <w:rPr>
+                <w:rFonts w:ascii="Arial" w:cs="Arial" w:eastAsia="Microsoft YaHei" w:hAnsi="Arial"/>
+                <w:color w:val="111110"/>
+                <w:sz w:val="18"/>
+                <w:szCs w:val="18"/>
+              </w:rPr>
+              <w:t xml:space="preserve">500,000 起</w:t>
+            </w:r>
+          </w:p>
+        </w:tc>
+        <w:tc>
+          <w:tcPr>
+            <w:tcW w:type="dxa" w:w="1428"/>
+            <w:tcBorders>
+              <w:top w:val="single" w:color="D9D6CF" w:sz="4"/>
+              <w:left w:val="none" w:color="FFFFFF" w:sz="0"/>
+              <w:bottom w:val="single" w:color="D9D6CF" w:sz="4"/>
+              <w:right w:val="none" w:color="FFFFFF" w:sz="0"/>
+            </w:tcBorders>
+            <w:tcMar>
+              <w:top w:type="dxa" w:w="80"/>
+              <w:left w:type="dxa" w:w="100"/>
+              <w:bottom w:type="dxa" w:w="80"/>
+              <w:right w:type="dxa" w:w="100"/>
+            </w:tcMar>
+            <w:vAlign w:val="center"/>
+          </w:tcPr>
+          <w:p>
+            <w:pPr>
+              <w:spacing w:after="0" w:line="270"/>
+              <w:jc w:val="right"/>
+            </w:pPr>
+            <w:r>
+              <w:rPr>
+                <w:rFonts w:ascii="Arial" w:cs="Arial" w:eastAsia="Microsoft YaHei" w:hAnsi="Arial"/>
+                <w:color w:val="111110"/>
+                <w:sz w:val="18"/>
+                <w:szCs w:val="18"/>
+              </w:rPr>
+              <w:t xml:space="preserve">80,000 起</w:t>
             </w:r>
           </w:p>
         </w:tc>
@@ -4112,45 +4252,15 @@
         </w:trPr>
         <w:tc>
           <w:tcPr>
-            <w:tcW w:type="dxa" w:w="760"/>
-            <w:tcBorders>
-              <w:top w:val="single" w:color="D9D6CF" w:sz="4"/>
-              <w:left w:val="none" w:color="FFFFFF" w:sz="0"/>
-              <w:bottom w:val="single" w:color="D9D6CF" w:sz="4"/>
-              <w:right w:val="none" w:color="FFFFFF" w:sz="0"/>
-            </w:tcBorders>
-            <w:tcMar>
-              <w:top w:type="dxa" w:w="80"/>
-              <w:left w:type="dxa" w:w="100"/>
-              <w:bottom w:type="dxa" w:w="80"/>
-              <w:right w:type="dxa" w:w="100"/>
-            </w:tcMar>
-            <w:vAlign w:val="center"/>
-          </w:tcPr>
-          <w:p>
-            <w:pPr>
-              <w:spacing w:after="0" w:line="270"/>
-            </w:pPr>
-            <w:r>
-              <w:rPr>
-                <w:rFonts w:ascii="Arial" w:cs="Arial" w:eastAsia="Microsoft YaHei" w:hAnsi="Arial"/>
-                <w:color w:val="6E6C66"/>
-                <w:sz w:val="17"/>
-                <w:szCs w:val="17"/>
-              </w:rPr>
-              <w:t xml:space="preserve">E01</w:t>
-            </w:r>
-          </w:p>
-        </w:tc>
-        <w:tc>
-          <w:tcPr>
-            <w:tcW w:type="dxa" w:w="2050"/>
-            <w:tcBorders>
-              <w:top w:val="single" w:color="D9D6CF" w:sz="4"/>
-              <w:left w:val="none" w:color="FFFFFF" w:sz="0"/>
-              <w:bottom w:val="single" w:color="D9D6CF" w:sz="4"/>
-              <w:right w:val="none" w:color="FFFFFF" w:sz="0"/>
-            </w:tcBorders>
+            <w:tcW w:type="dxa" w:w="9638"/>
+            <w:gridSpan w:val="6"/>
+            <w:tcBorders>
+              <w:top w:val="single" w:color="D9D6CF" w:sz="4"/>
+              <w:left w:val="none" w:color="FFFFFF" w:sz="0"/>
+              <w:bottom w:val="single" w:color="D9D6CF" w:sz="4"/>
+              <w:right w:val="none" w:color="FFFFFF" w:sz="0"/>
+            </w:tcBorders>
+            <w:shd w:fill="F2F0EB" w:color="auto" w:val="clear"/>
             <w:tcMar>
               <w:top w:type="dxa" w:w="80"/>
               <w:left w:type="dxa" w:w="100"/>
@@ -4168,141 +4278,31 @@
                 <w:rFonts w:ascii="Arial" w:cs="Arial" w:eastAsia="Microsoft YaHei" w:hAnsi="Arial"/>
                 <w:b/>
                 <w:bCs/>
-                <w:color w:val="111110"/>
-                <w:sz w:val="18"/>
-                <w:szCs w:val="18"/>
-              </w:rPr>
-              <w:t xml:space="preserve">试点（Pilot）</w:t>
-            </w:r>
-          </w:p>
-        </w:tc>
-        <w:tc>
-          <w:tcPr>
-            <w:tcW w:type="dxa" w:w="2800"/>
-            <w:tcBorders>
-              <w:top w:val="single" w:color="D9D6CF" w:sz="4"/>
-              <w:left w:val="none" w:color="FFFFFF" w:sz="0"/>
-              <w:bottom w:val="single" w:color="D9D6CF" w:sz="4"/>
-              <w:right w:val="none" w:color="FFFFFF" w:sz="0"/>
-            </w:tcBorders>
-            <w:tcMar>
-              <w:top w:type="dxa" w:w="80"/>
-              <w:left w:type="dxa" w:w="100"/>
-              <w:bottom w:type="dxa" w:w="80"/>
-              <w:right w:type="dxa" w:w="100"/>
-            </w:tcMar>
-            <w:vAlign w:val="center"/>
-          </w:tcPr>
-          <w:p>
-            <w:pPr>
-              <w:spacing w:after="0" w:line="270"/>
-            </w:pPr>
-            <w:r>
-              <w:rPr>
-                <w:rFonts w:ascii="Arial" w:cs="Arial" w:eastAsia="Microsoft YaHei" w:hAnsi="Arial"/>
-                <w:color w:val="33322F"/>
-                <w:sz w:val="17"/>
-                <w:szCs w:val="17"/>
-              </w:rPr>
-              <w:t xml:space="preserve">50–200 条样本，验证质量与流程</w:t>
-            </w:r>
-          </w:p>
-        </w:tc>
-        <w:tc>
-          <w:tcPr>
-            <w:tcW w:type="dxa" w:w="1000"/>
-            <w:tcBorders>
-              <w:top w:val="single" w:color="D9D6CF" w:sz="4"/>
-              <w:left w:val="none" w:color="FFFFFF" w:sz="0"/>
-              <w:bottom w:val="single" w:color="D9D6CF" w:sz="4"/>
-              <w:right w:val="none" w:color="FFFFFF" w:sz="0"/>
-            </w:tcBorders>
-            <w:tcMar>
-              <w:top w:type="dxa" w:w="80"/>
-              <w:left w:type="dxa" w:w="100"/>
-              <w:bottom w:type="dxa" w:w="80"/>
-              <w:right w:type="dxa" w:w="100"/>
-            </w:tcMar>
-            <w:vAlign w:val="center"/>
-          </w:tcPr>
-          <w:p>
-            <w:pPr>
-              <w:spacing w:after="0" w:line="270"/>
-            </w:pPr>
-            <w:r>
-              <w:rPr>
-                <w:rFonts w:ascii="Arial" w:cs="Arial" w:eastAsia="Microsoft YaHei" w:hAnsi="Arial"/>
-                <w:color w:val="33322F"/>
-                <w:sz w:val="17"/>
-                <w:szCs w:val="17"/>
-              </w:rPr>
-              <w:t xml:space="preserve">项目</w:t>
-            </w:r>
-          </w:p>
-        </w:tc>
-        <w:tc>
-          <w:tcPr>
-            <w:tcW w:type="dxa" w:w="1600"/>
-            <w:tcBorders>
-              <w:top w:val="single" w:color="D9D6CF" w:sz="4"/>
-              <w:left w:val="none" w:color="FFFFFF" w:sz="0"/>
-              <w:bottom w:val="single" w:color="D9D6CF" w:sz="4"/>
-              <w:right w:val="none" w:color="FFFFFF" w:sz="0"/>
-            </w:tcBorders>
-            <w:tcMar>
-              <w:top w:type="dxa" w:w="80"/>
-              <w:left w:type="dxa" w:w="100"/>
-              <w:bottom w:type="dxa" w:w="80"/>
-              <w:right w:type="dxa" w:w="100"/>
-            </w:tcMar>
-            <w:vAlign w:val="center"/>
-          </w:tcPr>
-          <w:p>
-            <w:pPr>
-              <w:spacing w:after="0" w:line="270"/>
-              <w:jc w:val="right"/>
-            </w:pPr>
-            <w:r>
-              <w:rPr>
-                <w:rFonts w:ascii="Arial" w:cs="Arial" w:eastAsia="Microsoft YaHei" w:hAnsi="Arial"/>
-                <w:color w:val="111110"/>
-                <w:sz w:val="18"/>
-                <w:szCs w:val="18"/>
-              </w:rPr>
-              <w:t xml:space="preserve">20,000 – 100,000</w:t>
-            </w:r>
-          </w:p>
-        </w:tc>
-        <w:tc>
-          <w:tcPr>
-            <w:tcW w:type="dxa" w:w="1428"/>
-            <w:tcBorders>
-              <w:top w:val="single" w:color="D9D6CF" w:sz="4"/>
-              <w:left w:val="none" w:color="FFFFFF" w:sz="0"/>
-              <w:bottom w:val="single" w:color="D9D6CF" w:sz="4"/>
-              <w:right w:val="none" w:color="FFFFFF" w:sz="0"/>
-            </w:tcBorders>
-            <w:tcMar>
-              <w:top w:type="dxa" w:w="80"/>
-              <w:left w:type="dxa" w:w="100"/>
-              <w:bottom w:type="dxa" w:w="80"/>
-              <w:right w:type="dxa" w:w="100"/>
-            </w:tcMar>
-            <w:vAlign w:val="center"/>
-          </w:tcPr>
-          <w:p>
-            <w:pPr>
-              <w:spacing w:after="0" w:line="270"/>
-              <w:jc w:val="right"/>
-            </w:pPr>
-            <w:r>
-              <w:rPr>
-                <w:rFonts w:ascii="Arial" w:cs="Arial" w:eastAsia="Microsoft YaHei" w:hAnsi="Arial"/>
-                <w:color w:val="111110"/>
-                <w:sz w:val="18"/>
-                <w:szCs w:val="18"/>
-              </w:rPr>
-              <w:t xml:space="preserve">5,000 – 15,000</w:t>
+                <w:color w:val="C2410C"/>
+                <w:sz w:val="18"/>
+                <w:szCs w:val="18"/>
+              </w:rPr>
+              <w:t xml:space="preserve">E</w:t>
+            </w:r>
+            <w:r>
+              <w:rPr>
+                <w:rFonts w:ascii="Arial" w:cs="Arial" w:eastAsia="Microsoft YaHei" w:hAnsi="Arial"/>
+                <w:b/>
+                <w:bCs/>
+                <w:color w:val="111110"/>
+                <w:sz w:val="18"/>
+                <w:szCs w:val="18"/>
+              </w:rPr>
+              <w:t xml:space="preserve">   服务</w:t>
+            </w:r>
+            <w:r>
+              <w:rPr>
+                <w:rFonts w:ascii="Arial" w:cs="Arial" w:eastAsia="Microsoft YaHei" w:hAnsi="Arial"/>
+                <w:color w:val="6E6C66"/>
+                <w:sz w:val="16"/>
+                <w:szCs w:val="16"/>
+              </w:rPr>
+              <w:t xml:space="preserve">   Services</w:t>
             </w:r>
           </w:p>
         </w:tc>
@@ -4339,7 +4339,7 @@
                 <w:sz w:val="17"/>
                 <w:szCs w:val="17"/>
               </w:rPr>
-              <w:t xml:space="preserve">E02</w:t>
+              <w:t xml:space="preserve">E01</w:t>
             </w:r>
           </w:p>
         </w:tc>
@@ -4373,6 +4373,207 @@
                 <w:sz w:val="18"/>
                 <w:szCs w:val="18"/>
               </w:rPr>
+              <w:t xml:space="preserve">试点（Pilot）</w:t>
+            </w:r>
+          </w:p>
+        </w:tc>
+        <w:tc>
+          <w:tcPr>
+            <w:tcW w:type="dxa" w:w="2800"/>
+            <w:tcBorders>
+              <w:top w:val="single" w:color="D9D6CF" w:sz="4"/>
+              <w:left w:val="none" w:color="FFFFFF" w:sz="0"/>
+              <w:bottom w:val="single" w:color="D9D6CF" w:sz="4"/>
+              <w:right w:val="none" w:color="FFFFFF" w:sz="0"/>
+            </w:tcBorders>
+            <w:tcMar>
+              <w:top w:type="dxa" w:w="80"/>
+              <w:left w:type="dxa" w:w="100"/>
+              <w:bottom w:type="dxa" w:w="80"/>
+              <w:right w:type="dxa" w:w="100"/>
+            </w:tcMar>
+            <w:vAlign w:val="center"/>
+          </w:tcPr>
+          <w:p>
+            <w:pPr>
+              <w:spacing w:after="0" w:line="270"/>
+            </w:pPr>
+            <w:r>
+              <w:rPr>
+                <w:rFonts w:ascii="Arial" w:cs="Arial" w:eastAsia="Microsoft YaHei" w:hAnsi="Arial"/>
+                <w:color w:val="33322F"/>
+                <w:sz w:val="17"/>
+                <w:szCs w:val="17"/>
+              </w:rPr>
+              <w:t xml:space="preserve">50–200 条样本，验证质量与流程</w:t>
+            </w:r>
+          </w:p>
+        </w:tc>
+        <w:tc>
+          <w:tcPr>
+            <w:tcW w:type="dxa" w:w="1000"/>
+            <w:tcBorders>
+              <w:top w:val="single" w:color="D9D6CF" w:sz="4"/>
+              <w:left w:val="none" w:color="FFFFFF" w:sz="0"/>
+              <w:bottom w:val="single" w:color="D9D6CF" w:sz="4"/>
+              <w:right w:val="none" w:color="FFFFFF" w:sz="0"/>
+            </w:tcBorders>
+            <w:tcMar>
+              <w:top w:type="dxa" w:w="80"/>
+              <w:left w:type="dxa" w:w="100"/>
+              <w:bottom w:type="dxa" w:w="80"/>
+              <w:right w:type="dxa" w:w="100"/>
+            </w:tcMar>
+            <w:vAlign w:val="center"/>
+          </w:tcPr>
+          <w:p>
+            <w:pPr>
+              <w:spacing w:after="0" w:line="270"/>
+            </w:pPr>
+            <w:r>
+              <w:rPr>
+                <w:rFonts w:ascii="Arial" w:cs="Arial" w:eastAsia="Microsoft YaHei" w:hAnsi="Arial"/>
+                <w:color w:val="33322F"/>
+                <w:sz w:val="17"/>
+                <w:szCs w:val="17"/>
+              </w:rPr>
+              <w:t xml:space="preserve">项目</w:t>
+            </w:r>
+          </w:p>
+        </w:tc>
+        <w:tc>
+          <w:tcPr>
+            <w:tcW w:type="dxa" w:w="1600"/>
+            <w:tcBorders>
+              <w:top w:val="single" w:color="D9D6CF" w:sz="4"/>
+              <w:left w:val="none" w:color="FFFFFF" w:sz="0"/>
+              <w:bottom w:val="single" w:color="D9D6CF" w:sz="4"/>
+              <w:right w:val="none" w:color="FFFFFF" w:sz="0"/>
+            </w:tcBorders>
+            <w:tcMar>
+              <w:top w:type="dxa" w:w="80"/>
+              <w:left w:type="dxa" w:w="100"/>
+              <w:bottom w:type="dxa" w:w="80"/>
+              <w:right w:type="dxa" w:w="100"/>
+            </w:tcMar>
+            <w:vAlign w:val="center"/>
+          </w:tcPr>
+          <w:p>
+            <w:pPr>
+              <w:spacing w:after="0" w:line="270"/>
+              <w:jc w:val="right"/>
+            </w:pPr>
+            <w:r>
+              <w:rPr>
+                <w:rFonts w:ascii="Arial" w:cs="Arial" w:eastAsia="Microsoft YaHei" w:hAnsi="Arial"/>
+                <w:color w:val="111110"/>
+                <w:sz w:val="18"/>
+                <w:szCs w:val="18"/>
+              </w:rPr>
+              <w:t xml:space="preserve">20,000 – 100,000</w:t>
+            </w:r>
+          </w:p>
+        </w:tc>
+        <w:tc>
+          <w:tcPr>
+            <w:tcW w:type="dxa" w:w="1428"/>
+            <w:tcBorders>
+              <w:top w:val="single" w:color="D9D6CF" w:sz="4"/>
+              <w:left w:val="none" w:color="FFFFFF" w:sz="0"/>
+              <w:bottom w:val="single" w:color="D9D6CF" w:sz="4"/>
+              <w:right w:val="none" w:color="FFFFFF" w:sz="0"/>
+            </w:tcBorders>
+            <w:tcMar>
+              <w:top w:type="dxa" w:w="80"/>
+              <w:left w:type="dxa" w:w="100"/>
+              <w:bottom w:type="dxa" w:w="80"/>
+              <w:right w:type="dxa" w:w="100"/>
+            </w:tcMar>
+            <w:vAlign w:val="center"/>
+          </w:tcPr>
+          <w:p>
+            <w:pPr>
+              <w:spacing w:after="0" w:line="270"/>
+              <w:jc w:val="right"/>
+            </w:pPr>
+            <w:r>
+              <w:rPr>
+                <w:rFonts w:ascii="Arial" w:cs="Arial" w:eastAsia="Microsoft YaHei" w:hAnsi="Arial"/>
+                <w:color w:val="111110"/>
+                <w:sz w:val="18"/>
+                <w:szCs w:val="18"/>
+              </w:rPr>
+              <w:t xml:space="preserve">5,000 – 15,000</w:t>
+            </w:r>
+          </w:p>
+        </w:tc>
+      </w:tr>
+      <w:tr>
+        <w:trPr>
+          <w:cantSplit/>
+        </w:trPr>
+        <w:tc>
+          <w:tcPr>
+            <w:tcW w:type="dxa" w:w="760"/>
+            <w:tcBorders>
+              <w:top w:val="single" w:color="D9D6CF" w:sz="4"/>
+              <w:left w:val="none" w:color="FFFFFF" w:sz="0"/>
+              <w:bottom w:val="single" w:color="D9D6CF" w:sz="4"/>
+              <w:right w:val="none" w:color="FFFFFF" w:sz="0"/>
+            </w:tcBorders>
+            <w:tcMar>
+              <w:top w:type="dxa" w:w="80"/>
+              <w:left w:type="dxa" w:w="100"/>
+              <w:bottom w:type="dxa" w:w="80"/>
+              <w:right w:type="dxa" w:w="100"/>
+            </w:tcMar>
+            <w:vAlign w:val="center"/>
+          </w:tcPr>
+          <w:p>
+            <w:pPr>
+              <w:spacing w:after="0" w:line="270"/>
+            </w:pPr>
+            <w:r>
+              <w:rPr>
+                <w:rFonts w:ascii="Arial" w:cs="Arial" w:eastAsia="Microsoft YaHei" w:hAnsi="Arial"/>
+                <w:color w:val="6E6C66"/>
+                <w:sz w:val="17"/>
+                <w:szCs w:val="17"/>
+              </w:rPr>
+              <w:t xml:space="preserve">E02</w:t>
+            </w:r>
+          </w:p>
+        </w:tc>
+        <w:tc>
+          <w:tcPr>
+            <w:tcW w:type="dxa" w:w="2050"/>
+            <w:tcBorders>
+              <w:top w:val="single" w:color="D9D6CF" w:sz="4"/>
+              <w:left w:val="none" w:color="FFFFFF" w:sz="0"/>
+              <w:bottom w:val="single" w:color="D9D6CF" w:sz="4"/>
+              <w:right w:val="none" w:color="FFFFFF" w:sz="0"/>
+            </w:tcBorders>
+            <w:tcMar>
+              <w:top w:type="dxa" w:w="80"/>
+              <w:left w:type="dxa" w:w="100"/>
+              <w:bottom w:type="dxa" w:w="80"/>
+              <w:right w:type="dxa" w:w="100"/>
+            </w:tcMar>
+            <w:vAlign w:val="center"/>
+          </w:tcPr>
+          <w:p>
+            <w:pPr>
+              <w:spacing w:after="0" w:line="270"/>
+            </w:pPr>
+            <w:r>
+              <w:rPr>
+                <w:rFonts w:ascii="Arial" w:cs="Arial" w:eastAsia="Microsoft YaHei" w:hAnsi="Arial"/>
+                <w:b/>
+                <w:bCs/>
+                <w:color w:val="111110"/>
+                <w:sz w:val="18"/>
+                <w:szCs w:val="18"/>
+              </w:rPr>
               <w:t xml:space="preserve">持续训练服务</w:t>
             </w:r>
           </w:p>
@@ -4504,6 +4705,469 @@
                 <w:szCs w:val="18"/>
               </w:rPr>
               <w:t xml:space="preserve">面议</w:t>
+            </w:r>
+          </w:p>
+        </w:tc>
+      </w:tr>
+      <w:tr>
+        <w:trPr>
+          <w:cantSplit/>
+        </w:trPr>
+        <w:tc>
+          <w:tcPr>
+            <w:tcW w:type="dxa" w:w="9638"/>
+            <w:gridSpan w:val="6"/>
+            <w:tcBorders>
+              <w:top w:val="single" w:color="D9D6CF" w:sz="4"/>
+              <w:left w:val="none" w:color="FFFFFF" w:sz="0"/>
+              <w:bottom w:val="single" w:color="D9D6CF" w:sz="4"/>
+              <w:right w:val="none" w:color="FFFFFF" w:sz="0"/>
+            </w:tcBorders>
+            <w:shd w:fill="F2F0EB" w:color="auto" w:val="clear"/>
+            <w:tcMar>
+              <w:top w:type="dxa" w:w="80"/>
+              <w:left w:type="dxa" w:w="100"/>
+              <w:bottom w:type="dxa" w:w="80"/>
+              <w:right w:type="dxa" w:w="100"/>
+            </w:tcMar>
+            <w:vAlign w:val="center"/>
+          </w:tcPr>
+          <w:p>
+            <w:pPr>
+              <w:spacing w:after="0" w:line="270"/>
+            </w:pPr>
+            <w:r>
+              <w:rPr>
+                <w:rFonts w:ascii="Arial" w:cs="Arial" w:eastAsia="Microsoft YaHei" w:hAnsi="Arial"/>
+                <w:b/>
+                <w:bCs/>
+                <w:color w:val="C2410C"/>
+                <w:sz w:val="18"/>
+                <w:szCs w:val="18"/>
+              </w:rPr>
+              <w:t xml:space="preserve">F</w:t>
+            </w:r>
+            <w:r>
+              <w:rPr>
+                <w:rFonts w:ascii="Arial" w:cs="Arial" w:eastAsia="Microsoft YaHei" w:hAnsi="Arial"/>
+                <w:b/>
+                <w:bCs/>
+                <w:color w:val="111110"/>
+                <w:sz w:val="18"/>
+                <w:szCs w:val="18"/>
+              </w:rPr>
+              <w:t xml:space="preserve">   多模态与原始数据</w:t>
+            </w:r>
+            <w:r>
+              <w:rPr>
+                <w:rFonts w:ascii="Arial" w:cs="Arial" w:eastAsia="Microsoft YaHei" w:hAnsi="Arial"/>
+                <w:color w:val="6E6C66"/>
+                <w:sz w:val="16"/>
+                <w:szCs w:val="16"/>
+              </w:rPr>
+              <w:t xml:space="preserve">   Multimodal &amp; Raw Data</w:t>
+            </w:r>
+          </w:p>
+        </w:tc>
+      </w:tr>
+      <w:tr>
+        <w:trPr>
+          <w:cantSplit/>
+        </w:trPr>
+        <w:tc>
+          <w:tcPr>
+            <w:tcW w:type="dxa" w:w="760"/>
+            <w:tcBorders>
+              <w:top w:val="single" w:color="D9D6CF" w:sz="4"/>
+              <w:left w:val="none" w:color="FFFFFF" w:sz="0"/>
+              <w:bottom w:val="single" w:color="D9D6CF" w:sz="4"/>
+              <w:right w:val="none" w:color="FFFFFF" w:sz="0"/>
+            </w:tcBorders>
+            <w:tcMar>
+              <w:top w:type="dxa" w:w="80"/>
+              <w:left w:type="dxa" w:w="100"/>
+              <w:bottom w:type="dxa" w:w="80"/>
+              <w:right w:type="dxa" w:w="100"/>
+            </w:tcMar>
+            <w:vAlign w:val="center"/>
+          </w:tcPr>
+          <w:p>
+            <w:pPr>
+              <w:spacing w:after="0" w:line="270"/>
+            </w:pPr>
+            <w:r>
+              <w:rPr>
+                <w:rFonts w:ascii="Arial" w:cs="Arial" w:eastAsia="Microsoft YaHei" w:hAnsi="Arial"/>
+                <w:color w:val="6E6C66"/>
+                <w:sz w:val="17"/>
+                <w:szCs w:val="17"/>
+              </w:rPr>
+              <w:t xml:space="preserve">F01</w:t>
+            </w:r>
+          </w:p>
+        </w:tc>
+        <w:tc>
+          <w:tcPr>
+            <w:tcW w:type="dxa" w:w="2050"/>
+            <w:tcBorders>
+              <w:top w:val="single" w:color="D9D6CF" w:sz="4"/>
+              <w:left w:val="none" w:color="FFFFFF" w:sz="0"/>
+              <w:bottom w:val="single" w:color="D9D6CF" w:sz="4"/>
+              <w:right w:val="none" w:color="FFFFFF" w:sz="0"/>
+            </w:tcBorders>
+            <w:tcMar>
+              <w:top w:type="dxa" w:w="80"/>
+              <w:left w:type="dxa" w:w="100"/>
+              <w:bottom w:type="dxa" w:w="80"/>
+              <w:right w:type="dxa" w:w="100"/>
+            </w:tcMar>
+            <w:vAlign w:val="center"/>
+          </w:tcPr>
+          <w:p>
+            <w:pPr>
+              <w:spacing w:after="0" w:line="270"/>
+            </w:pPr>
+            <w:r>
+              <w:rPr>
+                <w:rFonts w:ascii="Arial" w:cs="Arial" w:eastAsia="Microsoft YaHei" w:hAnsi="Arial"/>
+                <w:b/>
+                <w:bCs/>
+                <w:color w:val="111110"/>
+                <w:sz w:val="18"/>
+                <w:szCs w:val="18"/>
+              </w:rPr>
+              <w:t xml:space="preserve">多模态训练与评测数据</w:t>
+            </w:r>
+          </w:p>
+        </w:tc>
+        <w:tc>
+          <w:tcPr>
+            <w:tcW w:type="dxa" w:w="2800"/>
+            <w:tcBorders>
+              <w:top w:val="single" w:color="D9D6CF" w:sz="4"/>
+              <w:left w:val="none" w:color="FFFFFF" w:sz="0"/>
+              <w:bottom w:val="single" w:color="D9D6CF" w:sz="4"/>
+              <w:right w:val="none" w:color="FFFFFF" w:sz="0"/>
+            </w:tcBorders>
+            <w:tcMar>
+              <w:top w:type="dxa" w:w="80"/>
+              <w:left w:type="dxa" w:w="100"/>
+              <w:bottom w:type="dxa" w:w="80"/>
+              <w:right w:type="dxa" w:w="100"/>
+            </w:tcMar>
+            <w:vAlign w:val="center"/>
+          </w:tcPr>
+          <w:p>
+            <w:pPr>
+              <w:spacing w:after="0" w:line="270"/>
+            </w:pPr>
+            <w:r>
+              <w:rPr>
+                <w:rFonts w:ascii="Arial" w:cs="Arial" w:eastAsia="Microsoft YaHei" w:hAnsi="Arial"/>
+                <w:color w:val="33322F"/>
+                <w:sz w:val="17"/>
+                <w:szCs w:val="17"/>
+              </w:rPr>
+              <w:t xml:space="preserve">图文、视频、音频的 SFT、偏好与评测数据</w:t>
+            </w:r>
+          </w:p>
+        </w:tc>
+        <w:tc>
+          <w:tcPr>
+            <w:tcW w:type="dxa" w:w="1000"/>
+            <w:tcBorders>
+              <w:top w:val="single" w:color="D9D6CF" w:sz="4"/>
+              <w:left w:val="none" w:color="FFFFFF" w:sz="0"/>
+              <w:bottom w:val="single" w:color="D9D6CF" w:sz="4"/>
+              <w:right w:val="none" w:color="FFFFFF" w:sz="0"/>
+            </w:tcBorders>
+            <w:tcMar>
+              <w:top w:type="dxa" w:w="80"/>
+              <w:left w:type="dxa" w:w="100"/>
+              <w:bottom w:type="dxa" w:w="80"/>
+              <w:right w:type="dxa" w:w="100"/>
+            </w:tcMar>
+            <w:vAlign w:val="center"/>
+          </w:tcPr>
+          <w:p>
+            <w:pPr>
+              <w:spacing w:after="0" w:line="270"/>
+            </w:pPr>
+            <w:r>
+              <w:rPr>
+                <w:rFonts w:ascii="Arial" w:cs="Arial" w:eastAsia="Microsoft YaHei" w:hAnsi="Arial"/>
+                <w:color w:val="33322F"/>
+                <w:sz w:val="17"/>
+                <w:szCs w:val="17"/>
+              </w:rPr>
+              <w:t xml:space="preserve">条</w:t>
+            </w:r>
+          </w:p>
+        </w:tc>
+        <w:tc>
+          <w:tcPr>
+            <w:tcW w:type="dxa" w:w="1600"/>
+            <w:tcBorders>
+              <w:top w:val="single" w:color="D9D6CF" w:sz="4"/>
+              <w:left w:val="none" w:color="FFFFFF" w:sz="0"/>
+              <w:bottom w:val="single" w:color="D9D6CF" w:sz="4"/>
+              <w:right w:val="none" w:color="FFFFFF" w:sz="0"/>
+            </w:tcBorders>
+            <w:tcMar>
+              <w:top w:type="dxa" w:w="80"/>
+              <w:left w:type="dxa" w:w="100"/>
+              <w:bottom w:type="dxa" w:w="80"/>
+              <w:right w:type="dxa" w:w="100"/>
+            </w:tcMar>
+            <w:vAlign w:val="center"/>
+          </w:tcPr>
+          <w:p>
+            <w:pPr>
+              <w:spacing w:after="0" w:line="270"/>
+              <w:jc w:val="right"/>
+            </w:pPr>
+            <w:r>
+              <w:rPr>
+                <w:rFonts w:ascii="Arial" w:cs="Arial" w:eastAsia="Microsoft YaHei" w:hAnsi="Arial"/>
+                <w:color w:val="111110"/>
+                <w:sz w:val="18"/>
+                <w:szCs w:val="18"/>
+              </w:rPr>
+              <w:t xml:space="preserve">按量报价</w:t>
+            </w:r>
+          </w:p>
+        </w:tc>
+        <w:tc>
+          <w:tcPr>
+            <w:tcW w:type="dxa" w:w="1428"/>
+            <w:tcBorders>
+              <w:top w:val="single" w:color="D9D6CF" w:sz="4"/>
+              <w:left w:val="none" w:color="FFFFFF" w:sz="0"/>
+              <w:bottom w:val="single" w:color="D9D6CF" w:sz="4"/>
+              <w:right w:val="none" w:color="FFFFFF" w:sz="0"/>
+            </w:tcBorders>
+            <w:tcMar>
+              <w:top w:type="dxa" w:w="80"/>
+              <w:left w:type="dxa" w:w="100"/>
+              <w:bottom w:type="dxa" w:w="80"/>
+              <w:right w:type="dxa" w:w="100"/>
+            </w:tcMar>
+            <w:vAlign w:val="center"/>
+          </w:tcPr>
+          <w:p>
+            <w:pPr>
+              <w:spacing w:after="0" w:line="270"/>
+              <w:jc w:val="right"/>
+            </w:pPr>
+            <w:r>
+              <w:rPr>
+                <w:rFonts w:ascii="Arial" w:cs="Arial" w:eastAsia="Microsoft YaHei" w:hAnsi="Arial"/>
+                <w:color w:val="111110"/>
+                <w:sz w:val="18"/>
+                <w:szCs w:val="18"/>
+              </w:rPr>
+              <w:t xml:space="preserve">按量报价</w:t>
+            </w:r>
+          </w:p>
+        </w:tc>
+      </w:tr>
+      <w:tr>
+        <w:trPr>
+          <w:cantSplit/>
+        </w:trPr>
+        <w:tc>
+          <w:tcPr>
+            <w:tcW w:type="dxa" w:w="760"/>
+            <w:tcBorders>
+              <w:top w:val="single" w:color="D9D6CF" w:sz="4"/>
+              <w:left w:val="none" w:color="FFFFFF" w:sz="0"/>
+              <w:bottom w:val="single" w:color="D9D6CF" w:sz="4"/>
+              <w:right w:val="none" w:color="FFFFFF" w:sz="0"/>
+            </w:tcBorders>
+            <w:tcMar>
+              <w:top w:type="dxa" w:w="80"/>
+              <w:left w:type="dxa" w:w="100"/>
+              <w:bottom w:type="dxa" w:w="80"/>
+              <w:right w:type="dxa" w:w="100"/>
+            </w:tcMar>
+            <w:vAlign w:val="center"/>
+          </w:tcPr>
+          <w:p>
+            <w:pPr>
+              <w:spacing w:after="0" w:line="270"/>
+            </w:pPr>
+            <w:r>
+              <w:rPr>
+                <w:rFonts w:ascii="Arial" w:cs="Arial" w:eastAsia="Microsoft YaHei" w:hAnsi="Arial"/>
+                <w:color w:val="6E6C66"/>
+                <w:sz w:val="17"/>
+                <w:szCs w:val="17"/>
+              </w:rPr>
+              <w:t xml:space="preserve">F02</w:t>
+            </w:r>
+          </w:p>
+        </w:tc>
+        <w:tc>
+          <w:tcPr>
+            <w:tcW w:type="dxa" w:w="2050"/>
+            <w:tcBorders>
+              <w:top w:val="single" w:color="D9D6CF" w:sz="4"/>
+              <w:left w:val="none" w:color="FFFFFF" w:sz="0"/>
+              <w:bottom w:val="single" w:color="D9D6CF" w:sz="4"/>
+              <w:right w:val="none" w:color="FFFFFF" w:sz="0"/>
+            </w:tcBorders>
+            <w:tcMar>
+              <w:top w:type="dxa" w:w="80"/>
+              <w:left w:type="dxa" w:w="100"/>
+              <w:bottom w:type="dxa" w:w="80"/>
+              <w:right w:type="dxa" w:w="100"/>
+            </w:tcMar>
+            <w:vAlign w:val="center"/>
+          </w:tcPr>
+          <w:p>
+            <w:pPr>
+              <w:spacing w:after="0" w:line="270"/>
+            </w:pPr>
+            <w:r>
+              <w:rPr>
+                <w:rFonts w:ascii="Arial" w:cs="Arial" w:eastAsia="Microsoft YaHei" w:hAnsi="Arial"/>
+                <w:b/>
+                <w:bCs/>
+                <w:color w:val="111110"/>
+                <w:sz w:val="18"/>
+                <w:szCs w:val="18"/>
+              </w:rPr>
+              <w:t xml:space="preserve">原始数据资源</w:t>
+            </w:r>
+          </w:p>
+        </w:tc>
+        <w:tc>
+          <w:tcPr>
+            <w:tcW w:type="dxa" w:w="2800"/>
+            <w:tcBorders>
+              <w:top w:val="single" w:color="D9D6CF" w:sz="4"/>
+              <w:left w:val="none" w:color="FFFFFF" w:sz="0"/>
+              <w:bottom w:val="single" w:color="D9D6CF" w:sz="4"/>
+              <w:right w:val="none" w:color="FFFFFF" w:sz="0"/>
+            </w:tcBorders>
+            <w:tcMar>
+              <w:top w:type="dxa" w:w="80"/>
+              <w:left w:type="dxa" w:w="100"/>
+              <w:bottom w:type="dxa" w:w="80"/>
+              <w:right w:type="dxa" w:w="100"/>
+            </w:tcMar>
+            <w:vAlign w:val="center"/>
+          </w:tcPr>
+          <w:p>
+            <w:pPr>
+              <w:spacing w:after="0" w:line="270"/>
+            </w:pPr>
+            <w:r>
+              <w:rPr>
+                <w:rFonts w:ascii="Arial" w:cs="Arial" w:eastAsia="Microsoft YaHei" w:hAnsi="Arial"/>
+                <w:color w:val="33322F"/>
+                <w:sz w:val="17"/>
+                <w:szCs w:val="17"/>
+              </w:rPr>
+              <w:t xml:space="preserve">图片、视频、音频、文本及海外多语种原始数据，合规采集</w:t>
+            </w:r>
+          </w:p>
+        </w:tc>
+        <w:tc>
+          <w:tcPr>
+            <w:tcW w:type="dxa" w:w="1000"/>
+            <w:tcBorders>
+              <w:top w:val="single" w:color="D9D6CF" w:sz="4"/>
+              <w:left w:val="none" w:color="FFFFFF" w:sz="0"/>
+              <w:bottom w:val="single" w:color="D9D6CF" w:sz="4"/>
+              <w:right w:val="none" w:color="FFFFFF" w:sz="0"/>
+            </w:tcBorders>
+            <w:tcMar>
+              <w:top w:type="dxa" w:w="80"/>
+              <w:left w:type="dxa" w:w="100"/>
+              <w:bottom w:type="dxa" w:w="80"/>
+              <w:right w:type="dxa" w:w="100"/>
+            </w:tcMar>
+            <w:vAlign w:val="center"/>
+          </w:tcPr>
+          <w:p>
+            <w:pPr>
+              <w:spacing w:after="0" w:line="270"/>
+            </w:pPr>
+            <w:r>
+              <w:rPr>
+                <w:rFonts w:ascii="Arial" w:cs="Arial" w:eastAsia="Microsoft YaHei" w:hAnsi="Arial"/>
+                <w:color w:val="33322F"/>
+                <w:sz w:val="17"/>
+                <w:szCs w:val="17"/>
+              </w:rPr>
+              <w:t xml:space="preserve">批次</w:t>
+            </w:r>
+          </w:p>
+        </w:tc>
+        <w:tc>
+          <w:tcPr>
+            <w:tcW w:type="dxa" w:w="1600"/>
+            <w:tcBorders>
+              <w:top w:val="single" w:color="D9D6CF" w:sz="4"/>
+              <w:left w:val="none" w:color="FFFFFF" w:sz="0"/>
+              <w:bottom w:val="single" w:color="D9D6CF" w:sz="4"/>
+              <w:right w:val="none" w:color="FFFFFF" w:sz="0"/>
+            </w:tcBorders>
+            <w:tcMar>
+              <w:top w:type="dxa" w:w="80"/>
+              <w:left w:type="dxa" w:w="100"/>
+              <w:bottom w:type="dxa" w:w="80"/>
+              <w:right w:type="dxa" w:w="100"/>
+            </w:tcMar>
+            <w:vAlign w:val="center"/>
+          </w:tcPr>
+          <w:p>
+            <w:pPr>
+              <w:spacing w:after="0" w:line="270"/>
+              <w:jc w:val="right"/>
+            </w:pPr>
+            <w:r>
+              <w:rPr>
+                <w:rFonts w:ascii="Arial" w:cs="Arial" w:eastAsia="Microsoft YaHei" w:hAnsi="Arial"/>
+                <w:color w:val="111110"/>
+                <w:sz w:val="18"/>
+                <w:szCs w:val="18"/>
+              </w:rPr>
+              <w:t xml:space="preserve">按量报价</w:t>
+            </w:r>
+          </w:p>
+        </w:tc>
+        <w:tc>
+          <w:tcPr>
+            <w:tcW w:type="dxa" w:w="1428"/>
+            <w:tcBorders>
+              <w:top w:val="single" w:color="D9D6CF" w:sz="4"/>
+              <w:left w:val="none" w:color="FFFFFF" w:sz="0"/>
+              <w:bottom w:val="single" w:color="D9D6CF" w:sz="4"/>
+              <w:right w:val="none" w:color="FFFFFF" w:sz="0"/>
+            </w:tcBorders>
+            <w:tcMar>
+              <w:top w:type="dxa" w:w="80"/>
+              <w:left w:type="dxa" w:w="100"/>
+              <w:bottom w:type="dxa" w:w="80"/>
+              <w:right w:type="dxa" w:w="100"/>
+            </w:tcMar>
+            <w:vAlign w:val="center"/>
+          </w:tcPr>
+          <w:p>
+            <w:pPr>
+              <w:spacing w:after="0" w:line="270"/>
+              <w:jc w:val="right"/>
+            </w:pPr>
+            <w:r>
+              <w:rPr>
+                <w:rFonts w:ascii="Arial" w:cs="Arial" w:eastAsia="Microsoft YaHei" w:hAnsi="Arial"/>
+                <w:color w:val="111110"/>
+                <w:sz w:val="18"/>
+                <w:szCs w:val="18"/>
+              </w:rPr>
+              <w:t xml:space="preserve">按量报价</w:t>
             </w:r>
           </w:p>
         </w:tc>

</xml_diff>